<commit_message>
Assessment Week5 Gate 5
</commit_message>
<xml_diff>
--- a/ReportDemo.docx
+++ b/ReportDemo.docx
@@ -3080,10 +3080,10 @@
           <w:szCs w:val="24"/>
         </w:rPr>
         <w:drawing>
-          <wp:inline distT="0" distB="0" distL="0" distR="0" wp14:anchorId="15BBEE36" wp14:editId="6EB68A8E">
-            <wp:extent cx="5486400" cy="3083560"/>
-            <wp:effectExtent l="0" t="0" r="0" b="2540"/>
-            <wp:docPr id="416308163" name="Picture 1"/>
+          <wp:inline distT="0" distB="0" distL="0" distR="0" wp14:anchorId="76AD9EE8" wp14:editId="52AA4609">
+            <wp:extent cx="5486400" cy="2932430"/>
+            <wp:effectExtent l="0" t="0" r="0" b="1270"/>
+            <wp:docPr id="766396118" name="Picture 1"/>
             <wp:cNvGraphicFramePr>
               <a:graphicFrameLocks xmlns:a="http://schemas.openxmlformats.org/drawingml/2006/main" noChangeAspect="1"/>
             </wp:cNvGraphicFramePr>
@@ -3091,7 +3091,7 @@
               <a:graphicData uri="http://schemas.openxmlformats.org/drawingml/2006/picture">
                 <pic:pic xmlns:pic="http://schemas.openxmlformats.org/drawingml/2006/picture">
                   <pic:nvPicPr>
-                    <pic:cNvPr id="416308163" name=""/>
+                    <pic:cNvPr id="766396118" name=""/>
                     <pic:cNvPicPr/>
                   </pic:nvPicPr>
                   <pic:blipFill>
@@ -3103,7 +3103,7 @@
                   <pic:spPr>
                     <a:xfrm>
                       <a:off x="0" y="0"/>
-                      <a:ext cx="5486400" cy="3083560"/>
+                      <a:ext cx="5486400" cy="2932430"/>
                     </a:xfrm>
                     <a:prstGeom prst="rect">
                       <a:avLst/>
@@ -3208,6 +3208,36 @@
           <w:sz w:val="24"/>
           <w:szCs w:val="24"/>
         </w:rPr>
+        <w:t>npx playwright test flaky.spec.ts --</w:t>
+      </w:r>
+      <w:r>
+        <w:rPr>
+          <w:sz w:val="24"/>
+          <w:szCs w:val="24"/>
+        </w:rPr>
+        <w:t>ui</w:t>
+      </w:r>
+    </w:p>
+    <w:p>
+      <w:pPr>
+        <w:rPr>
+          <w:sz w:val="24"/>
+          <w:szCs w:val="24"/>
+        </w:rPr>
+      </w:pPr>
+    </w:p>
+    <w:p>
+      <w:pPr>
+        <w:rPr>
+          <w:sz w:val="24"/>
+          <w:szCs w:val="24"/>
+        </w:rPr>
+      </w:pPr>
+      <w:r>
+        <w:rPr>
+          <w:sz w:val="24"/>
+          <w:szCs w:val="24"/>
+        </w:rPr>
         <w:t>npx playwright test offlinepos.spec.ts</w:t>
       </w:r>
     </w:p>
@@ -3223,7 +3253,6 @@
           <w:sz w:val="24"/>
           <w:szCs w:val="24"/>
         </w:rPr>
-        <w:lastRenderedPageBreak/>
         <w:t>npx playwright test refundAndReturnWithEvidenceAndLog.spec.ts</w:t>
       </w:r>
     </w:p>
@@ -3815,10 +3844,10 @@
           <w:szCs w:val="24"/>
         </w:rPr>
         <w:drawing>
-          <wp:inline distT="0" distB="0" distL="0" distR="0" wp14:anchorId="4BD7A09B" wp14:editId="1DC18109">
-            <wp:extent cx="5486400" cy="3868420"/>
+          <wp:inline distT="0" distB="0" distL="0" distR="0" wp14:anchorId="6EAE4BB3" wp14:editId="3B153BC7">
+            <wp:extent cx="5486400" cy="1835785"/>
             <wp:effectExtent l="0" t="0" r="0" b="0"/>
-            <wp:docPr id="1045325229" name="Picture 1"/>
+            <wp:docPr id="2000825389" name="Picture 1"/>
             <wp:cNvGraphicFramePr>
               <a:graphicFrameLocks xmlns:a="http://schemas.openxmlformats.org/drawingml/2006/main" noChangeAspect="1"/>
             </wp:cNvGraphicFramePr>
@@ -3826,7 +3855,7 @@
               <a:graphicData uri="http://schemas.openxmlformats.org/drawingml/2006/picture">
                 <pic:pic xmlns:pic="http://schemas.openxmlformats.org/drawingml/2006/picture">
                   <pic:nvPicPr>
-                    <pic:cNvPr id="1045325229" name=""/>
+                    <pic:cNvPr id="2000825389" name=""/>
                     <pic:cNvPicPr/>
                   </pic:nvPicPr>
                   <pic:blipFill>
@@ -3838,7 +3867,7 @@
                   <pic:spPr>
                     <a:xfrm>
                       <a:off x="0" y="0"/>
-                      <a:ext cx="5486400" cy="3868420"/>
+                      <a:ext cx="5486400" cy="1835785"/>
                     </a:xfrm>
                     <a:prstGeom prst="rect">
                       <a:avLst/>
@@ -3863,7 +3892,6 @@
           <w:sz w:val="24"/>
           <w:szCs w:val="24"/>
         </w:rPr>
-        <w:lastRenderedPageBreak/>
         <w:drawing>
           <wp:inline distT="0" distB="0" distL="0" distR="0" wp14:anchorId="292C74C2" wp14:editId="768219ED">
             <wp:extent cx="5486400" cy="2784475"/>
@@ -3962,6 +3990,7 @@
           <w:sz w:val="24"/>
           <w:szCs w:val="24"/>
         </w:rPr>
+        <w:lastRenderedPageBreak/>
         <w:drawing>
           <wp:inline distT="0" distB="0" distL="0" distR="0" wp14:anchorId="738DF075" wp14:editId="5BEAD4CB">
             <wp:extent cx="5486400" cy="1456055"/>
@@ -4011,7 +4040,6 @@
           <w:sz w:val="24"/>
           <w:szCs w:val="24"/>
         </w:rPr>
-        <w:lastRenderedPageBreak/>
         <w:drawing>
           <wp:inline distT="0" distB="0" distL="0" distR="0" wp14:anchorId="70E6F343" wp14:editId="73DB1071">
             <wp:extent cx="5486400" cy="4598670"/>
@@ -4159,6 +4187,7 @@
           <w:szCs w:val="24"/>
           <w:lang w:val="en-IN"/>
         </w:rPr>
+        <w:lastRenderedPageBreak/>
         <w:t>Failure Reason</w:t>
       </w:r>
     </w:p>
@@ -4241,7 +4270,6 @@
           <w:szCs w:val="24"/>
           <w:lang w:val="en-IN"/>
         </w:rPr>
-        <w:lastRenderedPageBreak/>
         <w:t>Recovery Steps</w:t>
       </w:r>
     </w:p>
@@ -4744,6 +4772,7 @@
           <w:szCs w:val="24"/>
           <w:lang w:val="en-IN"/>
         </w:rPr>
+        <w:lastRenderedPageBreak/>
         <w:t xml:space="preserve">Confirm the failed request is captured in the logs or evidence. </w:t>
       </w:r>
     </w:p>
@@ -4826,7 +4855,6 @@
           <w:szCs w:val="24"/>
           <w:lang w:val="en-IN"/>
         </w:rPr>
-        <w:lastRenderedPageBreak/>
         <w:t xml:space="preserve">UI remains consistent with the server state. </w:t>
       </w:r>
     </w:p>
@@ -5253,6 +5281,7 @@
           <w:szCs w:val="24"/>
           <w:lang w:val="en-IN"/>
         </w:rPr>
+        <w:lastRenderedPageBreak/>
         <w:t>Failure Reason</w:t>
       </w:r>
     </w:p>
@@ -5335,7 +5364,6 @@
           <w:szCs w:val="24"/>
           <w:lang w:val="en-IN"/>
         </w:rPr>
-        <w:lastRenderedPageBreak/>
         <w:t>Recovery Steps</w:t>
       </w:r>
     </w:p>
@@ -5745,6 +5773,7 @@
           <w:szCs w:val="24"/>
           <w:lang w:val="en-IN"/>
         </w:rPr>
+        <w:lastRenderedPageBreak/>
         <w:t xml:space="preserve">Confirm the outbox count becomes </w:t>
       </w:r>
       <w:r>
@@ -5845,7 +5874,6 @@
           <w:szCs w:val="24"/>
           <w:lang w:val="en-IN"/>
         </w:rPr>
-        <w:lastRenderedPageBreak/>
         <w:t xml:space="preserve">Sale is synchronized successfully after the response. </w:t>
       </w:r>
     </w:p>
@@ -6156,6 +6184,49 @@
           <w:lang w:val="en-IN"/>
         </w:rPr>
       </w:pPr>
+      <w:r>
+        <w:rPr>
+          <w:sz w:val="24"/>
+          <w:szCs w:val="24"/>
+          <w:lang w:val="en-IN"/>
+        </w:rPr>
+        <w:lastRenderedPageBreak/>
+        <w:drawing>
+          <wp:inline distT="0" distB="0" distL="0" distR="0" wp14:anchorId="38FAF6FF" wp14:editId="72F48997">
+            <wp:extent cx="5486400" cy="1725930"/>
+            <wp:effectExtent l="0" t="0" r="0" b="7620"/>
+            <wp:docPr id="619351723" name="Picture 1"/>
+            <wp:cNvGraphicFramePr>
+              <a:graphicFrameLocks xmlns:a="http://schemas.openxmlformats.org/drawingml/2006/main" noChangeAspect="1"/>
+            </wp:cNvGraphicFramePr>
+            <a:graphic xmlns:a="http://schemas.openxmlformats.org/drawingml/2006/main">
+              <a:graphicData uri="http://schemas.openxmlformats.org/drawingml/2006/picture">
+                <pic:pic xmlns:pic="http://schemas.openxmlformats.org/drawingml/2006/picture">
+                  <pic:nvPicPr>
+                    <pic:cNvPr id="619351723" name=""/>
+                    <pic:cNvPicPr/>
+                  </pic:nvPicPr>
+                  <pic:blipFill>
+                    <a:blip r:embed="rId31"/>
+                    <a:stretch>
+                      <a:fillRect/>
+                    </a:stretch>
+                  </pic:blipFill>
+                  <pic:spPr>
+                    <a:xfrm>
+                      <a:off x="0" y="0"/>
+                      <a:ext cx="5486400" cy="1725930"/>
+                    </a:xfrm>
+                    <a:prstGeom prst="rect">
+                      <a:avLst/>
+                    </a:prstGeom>
+                  </pic:spPr>
+                </pic:pic>
+              </a:graphicData>
+            </a:graphic>
+          </wp:inline>
+        </w:drawing>
+      </w:r>
     </w:p>
     <w:p>
       <w:pPr>
@@ -6290,7 +6361,6 @@
           <w:szCs w:val="24"/>
           <w:lang w:val="en-IN"/>
         </w:rPr>
-        <w:lastRenderedPageBreak/>
         <w:t>By combining UI testing, API validation, logging, diagnostics, and automated evidence capture, the framework was able to detect potential issues such as duplicate refunds, over-refunds, network failures, and synchronization problems while ensuring the application recovered correctly. The use of structured logging, correlation IDs, screenshots, traces, and evidence attachments also improved debugging and simplified root cause analysis.</w:t>
       </w:r>
     </w:p>

</xml_diff>